<commit_message>
Updating Annotation files + Creating 'etapa_3' + organizing directories
</commit_message>
<xml_diff>
--- a/data/Etapa 2 - Anotações Induzidas/Controle_de_anotações_2.docx
+++ b/data/Etapa 2 - Anotações Induzidas/Controle_de_anotações_2.docx
@@ -1134,7 +1134,7 @@
               <w:rPr>
                 <w:rtl w:val="0"/>
               </w:rPr>
-              <w:t xml:space="preserve">300</w:t>
+              <w:t xml:space="preserve">400</w:t>
             </w:r>
           </w:p>
         </w:tc>
@@ -1518,24 +1518,8 @@
             </w:pPr>
             <w:r>
               <w:rPr>
-                <w:rtl w:val="0"/>
-              </w:rPr>
-            </w:r>
-          </w:p>
-          <w:p>
-            <w:pPr>
-              <w:widowControl w:val="0"/>
-              <w:spacing w:line="240" w:lineRule="auto"/>
-              <w:jc w:val="center"/>
-              <w:rPr>
                 <w:b w:val="1"/>
                 <w:bCs w:val="1"/>
-              </w:rPr>
-            </w:pPr>
-            <w:r>
-              <w:rPr>
-                <w:b w:val="1"/>
-                <w:bCs w:val="1"/>
                 <w:rtl w:val="0"/>
               </w:rPr>
               <w:t xml:space="preserve">Contas Suspensas</w:t>
@@ -1697,7 +1681,7 @@
               <w:rPr>
                 <w:rtl w:val="0"/>
               </w:rPr>
-              <w:t xml:space="preserve">300</w:t>
+              <w:t xml:space="preserve">400</w:t>
             </w:r>
           </w:p>
         </w:tc>
@@ -2071,6 +2055,19 @@
               <w:widowControl w:val="0"/>
               <w:spacing w:line="240" w:lineRule="auto"/>
               <w:jc w:val="center"/>
+              <w:rPr/>
+            </w:pPr>
+            <w:r>
+              <w:rPr>
+                <w:rtl w:val="0"/>
+              </w:rPr>
+            </w:r>
+          </w:p>
+          <w:p>
+            <w:pPr>
+              <w:widowControl w:val="0"/>
+              <w:spacing w:line="240" w:lineRule="auto"/>
+              <w:jc w:val="center"/>
               <w:rPr>
                 <w:b w:val="1"/>
                 <w:bCs w:val="1"/>
@@ -2078,24 +2075,8 @@
             </w:pPr>
             <w:r>
               <w:rPr>
-                <w:rtl w:val="0"/>
-              </w:rPr>
-            </w:r>
-          </w:p>
-          <w:p>
-            <w:pPr>
-              <w:widowControl w:val="0"/>
-              <w:spacing w:line="240" w:lineRule="auto"/>
-              <w:jc w:val="center"/>
-              <w:rPr>
                 <w:b w:val="1"/>
                 <w:bCs w:val="1"/>
-              </w:rPr>
-            </w:pPr>
-            <w:r>
-              <w:rPr>
-                <w:b w:val="1"/>
-                <w:bCs w:val="1"/>
                 <w:rtl w:val="0"/>
               </w:rPr>
               <w:t xml:space="preserve">Mandetta</w:t>
@@ -2257,7 +2238,7 @@
               <w:rPr>
                 <w:rtl w:val="0"/>
               </w:rPr>
-              <w:t xml:space="preserve">300</w:t>
+              <w:t xml:space="preserve">400</w:t>
             </w:r>
           </w:p>
         </w:tc>

</xml_diff>